<commit_message>
Revert "rename: Mandarin → Mandarin（仓库、exe、窗口标题、启动脚本、README）"
This reverts commit ea8ef3499b7918eb6faa45e1b9ca641932a9bd48.
</commit_message>
<xml_diff>
--- a/桌宠1.0_项目介绍.docx
+++ b/桌宠1.0_项目介绍.docx
@@ -34,12 +34,20 @@
         <w:jc w:val="center"/>
       </w:pPr>
       <w:r>
-        <w:t>文档版本：2.1</w:t>
+        <w:rPr>
+          <w:color w:val="999999"/>
+          <w:sz w:val="20"/>
+        </w:rPr>
+        <w:t>文档版本：1.0</w:t>
+        <w:br/>
+        <w:t>生成日期：2026年6月8日</w:t>
+        <w:br/>
+        <w:t>核心角色：ATRI</w:t>
       </w:r>
     </w:p>
     <w:p>
       <w:r>
-        <w:t>生成日期：2026年6月19日</w:t>
+        <w:br w:type="page"/>
       </w:r>
     </w:p>
     <w:p>
@@ -52,12 +60,12 @@
     </w:p>
     <w:p>
       <w:r>
-        <w:t>本项目是一个 AI 桌面宠物（桌宠）系统，以 Galgame（美少女游戏）风格的立绘演出方式呈现。核心角色是 ATRI（来自视觉小说《ATRI -My Dear Moments-》的女主角）。桌宠可以显示在桌面上，与用户进行文字对话、语音交互，支持语音唤醒、连续对话、屏幕识别等多模态交互，并支持立绘动画效果。</w:t>
+        <w:t>本项目是一个 AI 桌面宠物（桌宠）系统，以 Galgame（美少女游戏）风格的立绘演出方式呈现。核心角色是 ATRI（来自视觉小说《ATRI -My Dear Moments-》的女主角）。桌宠可以显示在桌面上，与用户进行文字对话、语音交互，并支持立绘动画效果。</w:t>
       </w:r>
     </w:p>
     <w:p>
       <w:r>
-        <w:t>项目由四个主要子系统组成：ZcChat2（Qt6/C++ 桌面应用）、vits-simple-api（Python 语音合成服务）、SomeGalActor_Vits（VITS 角色语音模型）、sherpa-onnx（离线关键词识别引擎）。</w:t>
+        <w:t>项目由三个主要子系统组成：ZcChat2（Qt6/C++ 桌面应用）、vits-simple-api（Python 语音合成服务）、SomeGalActor_Vits（VITS 角色语音模型）。</w:t>
       </w:r>
     </w:p>
     <w:p>
@@ -79,73 +87,12 @@
         <w:ind w:left="454"/>
       </w:pPr>
       <w:r>
-        <w:t>┌──────────────────────────────────────────────────────────────┐</w:t>
-        <w:br/>
-        <w:t>│                     桌宠1.0 整体架构（v2.1）                   │</w:t>
-        <w:br/>
-        <w:t>├──────────────────────────────────────────────────────────────┤</w:t>
-        <w:br/>
-        <w:t>│                                                              │</w:t>
-        <w:br/>
-        <w:t>│  ┌─────────────────┐                                        │</w:t>
-        <w:br/>
-        <w:t>│  │   ZcChat2        │  ← Qt6/C++ 桌面应用                     │</w:t>
-        <w:br/>
-        <w:t>│  │   (主程序)        │    立绘 + 对话 + 设置 + 语音唤醒         │</w:t>
-        <w:br/>
-        <w:t>│  └───────┬─────────┘                                        │</w:t>
-        <w:br/>
-        <w:t>│          │                                                    │</w:t>
-        <w:br/>
-        <w:t>│          ├── HTTP ──► vits-simple-api                         │</w:t>
-        <w:br/>
-        <w:t>│          │              (语音合成服务, :23456)                  │</w:t>
-        <w:br/>
-        <w:t>│          │                                                    │</w:t>
-        <w:br/>
-        <w:t>│          ├── HTTP ──► LLM API                                 │</w:t>
-        <w:br/>
-        <w:t>│          │              (DeepSeek / OpenAI / Kimi / 自定义)     │</w:t>
-        <w:br/>
-        <w:t>│          │                                                    │</w:t>
-        <w:br/>
-        <w:t>│          ├── HTTP ──► 百度语音识别 API                          │</w:t>
-        <w:br/>
-        <w:t>│          │              (语音转文字)                             │</w:t>
-        <w:br/>
-        <w:t>│          │                                                    │</w:t>
-        <w:br/>
-        <w:t>│          ├── HTTP ──► Kimi 视觉 API                            │</w:t>
-        <w:br/>
-        <w:t>│          │              (屏幕截图分析)                           │</w:t>
-        <w:br/>
-        <w:t>│          │                                                    │</w:t>
-        <w:br/>
-        <w:t>│          └── 本地 ──► sherpa-onnx                              │</w:t>
-        <w:br/>
-        <w:t>│                         (离线关键词唤醒, "萝卜子")               │</w:t>
-        <w:br/>
-        <w:t>│                                                              │</w:t>
-        <w:br/>
-        <w:t>│  ┌─────────────────┐                                        │</w:t>
-        <w:br/>
-        <w:t>│  │ SomeGalActor_Vits│  ← VITS 角色语音模型                      │</w:t>
-        <w:br/>
-        <w:t>│  │ (模型文件)       │    包含 ATRI 等 13 位角色                  │</w:t>
-        <w:br/>
-        <w:t>│  └─────────────────┘                                        │</w:t>
-        <w:br/>
-        <w:t>│                                                              │</w:t>
-        <w:br/>
-        <w:t>│  ┌─────────────────┐                                        │</w:t>
-        <w:br/>
-        <w:t>│  │ sherpa-onnx      │  ← 离线关键词识别引擎                     │</w:t>
-        <w:br/>
-        <w:t>│  │ (KWS模型)        │    3.3M Zipformer 模型, 中文唤醒词        │</w:t>
-        <w:br/>
-        <w:t>│  └─────────────────┘                                        │</w:t>
-        <w:br/>
-        <w:t>└──────────────────────────────────────────────────────────────┘</w:t>
+        <w:rPr>
+          <w:rFonts w:ascii="Consolas" w:hAnsi="Consolas"/>
+          <w:color w:val="333333"/>
+          <w:sz w:val="17"/>
+        </w:rPr>
+        <w:t>┌──────────────────────────────────────────────────┐</w:t>
       </w:r>
     </w:p>
     <w:p>
@@ -153,154 +100,308 @@
         <w:spacing w:before="0" w:after="0" w:line="320" w:lineRule="exact"/>
         <w:ind w:left="454"/>
       </w:pPr>
-      <w:r/>
+      <w:r>
+        <w:rPr>
+          <w:rFonts w:ascii="Consolas" w:hAnsi="Consolas"/>
+          <w:color w:val="333333"/>
+          <w:sz w:val="17"/>
+        </w:rPr>
+        <w:t>│                  桌宠1.0 整体架构                   │</w:t>
+      </w:r>
     </w:p>
     <w:p>
       <w:pPr>
         <w:spacing w:before="0" w:after="0" w:line="320" w:lineRule="exact"/>
         <w:ind w:left="454"/>
       </w:pPr>
-      <w:r/>
+      <w:r>
+        <w:rPr>
+          <w:rFonts w:ascii="Consolas" w:hAnsi="Consolas"/>
+          <w:color w:val="333333"/>
+          <w:sz w:val="17"/>
+        </w:rPr>
+        <w:t>├──────────────────────────────────────────────────┤</w:t>
+      </w:r>
     </w:p>
     <w:p>
       <w:pPr>
         <w:spacing w:before="0" w:after="0" w:line="320" w:lineRule="exact"/>
         <w:ind w:left="454"/>
       </w:pPr>
-      <w:r/>
+      <w:r>
+        <w:rPr>
+          <w:rFonts w:ascii="Consolas" w:hAnsi="Consolas"/>
+          <w:color w:val="333333"/>
+          <w:sz w:val="17"/>
+        </w:rPr>
+        <w:t>│                                                  │</w:t>
+      </w:r>
     </w:p>
     <w:p>
       <w:pPr>
         <w:spacing w:before="0" w:after="0" w:line="320" w:lineRule="exact"/>
         <w:ind w:left="454"/>
       </w:pPr>
-      <w:r/>
+      <w:r>
+        <w:rPr>
+          <w:rFonts w:ascii="Consolas" w:hAnsi="Consolas"/>
+          <w:color w:val="333333"/>
+          <w:sz w:val="17"/>
+        </w:rPr>
+        <w:t>│  ┌─────────────────┐                            │</w:t>
+      </w:r>
     </w:p>
     <w:p>
       <w:pPr>
         <w:spacing w:before="0" w:after="0" w:line="320" w:lineRule="exact"/>
         <w:ind w:left="454"/>
       </w:pPr>
-      <w:r/>
+      <w:r>
+        <w:rPr>
+          <w:rFonts w:ascii="Consolas" w:hAnsi="Consolas"/>
+          <w:color w:val="333333"/>
+          <w:sz w:val="17"/>
+        </w:rPr>
+        <w:t>│  │   ZcChat2        │  ← Qt6/C++ 桌面应用         │</w:t>
+      </w:r>
     </w:p>
     <w:p>
       <w:pPr>
         <w:spacing w:before="0" w:after="0" w:line="320" w:lineRule="exact"/>
         <w:ind w:left="454"/>
       </w:pPr>
-      <w:r/>
+      <w:r>
+        <w:rPr>
+          <w:rFonts w:ascii="Consolas" w:hAnsi="Consolas"/>
+          <w:color w:val="333333"/>
+          <w:sz w:val="17"/>
+        </w:rPr>
+        <w:t>│  │   (主程序)        │    立绘 + 对话 + 设置        │</w:t>
+      </w:r>
     </w:p>
     <w:p>
       <w:pPr>
         <w:spacing w:before="0" w:after="0" w:line="320" w:lineRule="exact"/>
         <w:ind w:left="454"/>
       </w:pPr>
-      <w:r/>
+      <w:r>
+        <w:rPr>
+          <w:rFonts w:ascii="Consolas" w:hAnsi="Consolas"/>
+          <w:color w:val="333333"/>
+          <w:sz w:val="17"/>
+        </w:rPr>
+        <w:t>│  └───────┬─────────┘                            │</w:t>
+      </w:r>
     </w:p>
     <w:p>
       <w:pPr>
         <w:spacing w:before="0" w:after="0" w:line="320" w:lineRule="exact"/>
         <w:ind w:left="454"/>
       </w:pPr>
-      <w:r/>
+      <w:r>
+        <w:rPr>
+          <w:rFonts w:ascii="Consolas" w:hAnsi="Consolas"/>
+          <w:color w:val="333333"/>
+          <w:sz w:val="17"/>
+        </w:rPr>
+        <w:t>│          │                                        │</w:t>
+      </w:r>
     </w:p>
     <w:p>
       <w:pPr>
         <w:spacing w:before="0" w:after="0" w:line="320" w:lineRule="exact"/>
         <w:ind w:left="454"/>
       </w:pPr>
-      <w:r/>
+      <w:r>
+        <w:rPr>
+          <w:rFonts w:ascii="Consolas" w:hAnsi="Consolas"/>
+          <w:color w:val="333333"/>
+          <w:sz w:val="17"/>
+        </w:rPr>
+        <w:t>│          ├── HTTP ──► vits-simple-api              │</w:t>
+      </w:r>
     </w:p>
     <w:p>
       <w:pPr>
         <w:spacing w:before="0" w:after="0" w:line="320" w:lineRule="exact"/>
         <w:ind w:left="454"/>
       </w:pPr>
-      <w:r/>
+      <w:r>
+        <w:rPr>
+          <w:rFonts w:ascii="Consolas" w:hAnsi="Consolas"/>
+          <w:color w:val="333333"/>
+          <w:sz w:val="17"/>
+        </w:rPr>
+        <w:t>│          │              (语音合成服务, :23456)      │</w:t>
+      </w:r>
     </w:p>
     <w:p>
       <w:pPr>
         <w:spacing w:before="0" w:after="0" w:line="320" w:lineRule="exact"/>
         <w:ind w:left="454"/>
       </w:pPr>
-      <w:r/>
+      <w:r>
+        <w:rPr>
+          <w:rFonts w:ascii="Consolas" w:hAnsi="Consolas"/>
+          <w:color w:val="333333"/>
+          <w:sz w:val="17"/>
+        </w:rPr>
+        <w:t>│          │                                        │</w:t>
+      </w:r>
     </w:p>
     <w:p>
       <w:pPr>
         <w:spacing w:before="0" w:after="0" w:line="320" w:lineRule="exact"/>
         <w:ind w:left="454"/>
       </w:pPr>
-      <w:r/>
+      <w:r>
+        <w:rPr>
+          <w:rFonts w:ascii="Consolas" w:hAnsi="Consolas"/>
+          <w:color w:val="333333"/>
+          <w:sz w:val="17"/>
+        </w:rPr>
+        <w:t>│          ├── HTTP ──► LLM API                      │</w:t>
+      </w:r>
     </w:p>
     <w:p>
       <w:pPr>
         <w:spacing w:before="0" w:after="0" w:line="320" w:lineRule="exact"/>
         <w:ind w:left="454"/>
       </w:pPr>
-      <w:r/>
+      <w:r>
+        <w:rPr>
+          <w:rFonts w:ascii="Consolas" w:hAnsi="Consolas"/>
+          <w:color w:val="333333"/>
+          <w:sz w:val="17"/>
+        </w:rPr>
+        <w:t>│          │              (DeepSeek / OpenAI / 自定义) │</w:t>
+      </w:r>
     </w:p>
     <w:p>
       <w:pPr>
         <w:spacing w:before="0" w:after="0" w:line="320" w:lineRule="exact"/>
         <w:ind w:left="454"/>
       </w:pPr>
-      <w:r/>
+      <w:r>
+        <w:rPr>
+          <w:rFonts w:ascii="Consolas" w:hAnsi="Consolas"/>
+          <w:color w:val="333333"/>
+          <w:sz w:val="17"/>
+        </w:rPr>
+        <w:t>│          │                                        │</w:t>
+      </w:r>
     </w:p>
     <w:p>
       <w:pPr>
         <w:spacing w:before="0" w:after="0" w:line="320" w:lineRule="exact"/>
         <w:ind w:left="454"/>
       </w:pPr>
-      <w:r/>
+      <w:r>
+        <w:rPr>
+          <w:rFonts w:ascii="Consolas" w:hAnsi="Consolas"/>
+          <w:color w:val="333333"/>
+          <w:sz w:val="17"/>
+        </w:rPr>
+        <w:t>│          └── HTTP ──► 百度语音识别 API               │</w:t>
+      </w:r>
     </w:p>
     <w:p>
       <w:pPr>
         <w:spacing w:before="0" w:after="0" w:line="320" w:lineRule="exact"/>
         <w:ind w:left="454"/>
       </w:pPr>
-      <w:r/>
+      <w:r>
+        <w:rPr>
+          <w:rFonts w:ascii="Consolas" w:hAnsi="Consolas"/>
+          <w:color w:val="333333"/>
+          <w:sz w:val="17"/>
+        </w:rPr>
+        <w:t>│                        (语音转文字)                  │</w:t>
+      </w:r>
     </w:p>
     <w:p>
       <w:pPr>
         <w:spacing w:before="0" w:after="0" w:line="320" w:lineRule="exact"/>
         <w:ind w:left="454"/>
       </w:pPr>
-      <w:r/>
+      <w:r>
+        <w:rPr>
+          <w:rFonts w:ascii="Consolas" w:hAnsi="Consolas"/>
+          <w:color w:val="333333"/>
+          <w:sz w:val="17"/>
+        </w:rPr>
+        <w:t>│                                                  │</w:t>
+      </w:r>
     </w:p>
     <w:p>
       <w:pPr>
         <w:spacing w:before="0" w:after="0" w:line="320" w:lineRule="exact"/>
         <w:ind w:left="454"/>
       </w:pPr>
-      <w:r/>
+      <w:r>
+        <w:rPr>
+          <w:rFonts w:ascii="Consolas" w:hAnsi="Consolas"/>
+          <w:color w:val="333333"/>
+          <w:sz w:val="17"/>
+        </w:rPr>
+        <w:t>│  ┌─────────────────┐                            │</w:t>
+      </w:r>
     </w:p>
     <w:p>
       <w:pPr>
         <w:spacing w:before="0" w:after="0" w:line="320" w:lineRule="exact"/>
         <w:ind w:left="454"/>
       </w:pPr>
-      <w:r/>
+      <w:r>
+        <w:rPr>
+          <w:rFonts w:ascii="Consolas" w:hAnsi="Consolas"/>
+          <w:color w:val="333333"/>
+          <w:sz w:val="17"/>
+        </w:rPr>
+        <w:t>│  │ SomeGalActor_Vits│  ← VITS 角色语音模型          │</w:t>
+      </w:r>
     </w:p>
     <w:p>
       <w:pPr>
         <w:spacing w:before="0" w:after="0" w:line="320" w:lineRule="exact"/>
         <w:ind w:left="454"/>
       </w:pPr>
-      <w:r/>
+      <w:r>
+        <w:rPr>
+          <w:rFonts w:ascii="Consolas" w:hAnsi="Consolas"/>
+          <w:color w:val="333333"/>
+          <w:sz w:val="17"/>
+        </w:rPr>
+        <w:t>│  │ (模型文件)       │    包含 ATRI 等 13 位角色      │</w:t>
+      </w:r>
     </w:p>
     <w:p>
       <w:pPr>
         <w:spacing w:before="0" w:after="0" w:line="320" w:lineRule="exact"/>
         <w:ind w:left="454"/>
       </w:pPr>
-      <w:r/>
+      <w:r>
+        <w:rPr>
+          <w:rFonts w:ascii="Consolas" w:hAnsi="Consolas"/>
+          <w:color w:val="333333"/>
+          <w:sz w:val="17"/>
+        </w:rPr>
+        <w:t>│  └─────────────────┘                            │</w:t>
+      </w:r>
     </w:p>
     <w:p>
       <w:pPr>
         <w:spacing w:before="0" w:after="0" w:line="320" w:lineRule="exact"/>
         <w:ind w:left="454"/>
       </w:pPr>
-      <w:r/>
+      <w:r>
+        <w:rPr>
+          <w:rFonts w:ascii="Consolas" w:hAnsi="Consolas"/>
+          <w:color w:val="333333"/>
+          <w:sz w:val="17"/>
+        </w:rPr>
+        <w:t>└──────────────────────────────────────────────────┘</w:t>
+      </w:r>
     </w:p>
     <w:p>
       <w:pPr>
@@ -932,7 +1033,7 @@
         <w:pStyle w:val="ListBullet"/>
       </w:pPr>
       <w:r>
-        <w:t>按钮录音：长按"语音输入"按钮开始录音，松开结束；支持静音自动停止（2.5秒无声音自动结束）</w:t>
+        <w:t>按钮录音：长按"语音输入"按钮开始录音，松开结束</w:t>
       </w:r>
     </w:p>
     <w:p>
@@ -948,7 +1049,7 @@
         <w:pStyle w:val="ListBullet"/>
       </w:pPr>
       <w:r>
-        <w:t>录音参数：16000Hz 采样率、单声道、16-bit PCM 直录（QAudioSource）</w:t>
+        <w:t>录音参数：16000Hz 采样率、单声道、AAC 编码 (m4a)</w:t>
       </w:r>
     </w:p>
     <w:p>
@@ -956,7 +1057,7 @@
         <w:pStyle w:val="ListBullet"/>
       </w:pPr>
       <w:r>
-        <w:t>静音检测：100ms 定时器轮询 + 帧计数器，RMS 阈值 0.005，自适应低音量麦克风</w:t>
+        <w:t>语音识别：录音结束后将 Base64 编码的音频发送到百度短语音识别 API</w:t>
       </w:r>
     </w:p>
     <w:p>
@@ -964,7 +1065,7 @@
         <w:pStyle w:val="ListBullet"/>
       </w:pPr>
       <w:r>
-        <w:t>语音识别：录音结束后将 PCM 音频发送到百度短语音识别 API（pcm 格式），最少1秒录音过滤误触发</w:t>
+        <w:t>自动发送：可配置识别完成后自动提交对话</w:t>
       </w:r>
     </w:p>
     <w:p>
@@ -972,7 +1073,7 @@
         <w:pStyle w:val="Heading3"/>
       </w:pPr>
       <w:r>
-        <w:t>自动发送：可配置识别完成后自动提交对话；连续对话模式下始终自动发送</w:t>
+        <w:t>C. 设置窗口 (windows/setting/)</w:t>
       </w:r>
     </w:p>
     <w:p>
@@ -2877,27 +2978,57 @@
     </w:p>
     <w:p>
       <w:r>
-        <w:t>开始录音：用户长按语音输入按钮 / 按下全局热键 / 说出唤醒词 / 进入连续对话模式，startSpeechRecording() 检查麦克风权限、创建 QAudioSource 直录 PCM</w:t>
+        <w:rPr>
+          <w:b/>
+        </w:rPr>
+        <w:t>开始录音：</w:t>
+      </w:r>
+      <w:r>
+        <w:t>用户长按语音输入按钮或按下全局热键，startSpeechRecording() 检查麦克风权限、配置录音参数</w:t>
       </w:r>
     </w:p>
     <w:p>
       <w:r>
-        <w:t>录音中：QAudioSource 录制 16000Hz/单声道/16-bit PCM 音频至内存缓冲区；同时 100ms 定时器轮询计算 RMS 进行静音检测</w:t>
+        <w:rPr>
+          <w:b/>
+        </w:rPr>
+        <w:t>录音中：</w:t>
+      </w:r>
+      <w:r>
+        <w:t>QMediaRecorder 录制 16000Hz/单声道/AAC(m4a) 音频至临时文件</w:t>
       </w:r>
     </w:p>
     <w:p>
       <w:r>
-        <w:t>停止录音：用户松开按钮 / 释放热键 / 2.5秒静音超时，stopSpeechRecording() 保存 PCM 文件并送百度识别</w:t>
+        <w:rPr>
+          <w:b/>
+        </w:rPr>
+        <w:t>停止录音：</w:t>
+      </w:r>
+      <w:r>
+        <w:t>用户松开按钮/释放热键，stopSpeechRecording() 结束录制</w:t>
       </w:r>
     </w:p>
     <w:p>
       <w:r>
-        <w:t>语音识别：PCM 音频 Base64 编码 → 百度语音识别 API（pcm 格式，先获取 OAuth Token，再提交音频数据）</w:t>
+        <w:rPr>
+          <w:b/>
+        </w:rPr>
+        <w:t>语音识别：</w:t>
+      </w:r>
+      <w:r>
+        <w:t>录音文件 Base64 编码 → 百度语音识别 API（先获取 OAuth Token，再提交音频数据）</w:t>
       </w:r>
     </w:p>
     <w:p>
       <w:r>
-        <w:t>结果处理：识别结果填入文本框，若开启自动发送或处于连续对话模式则直接调用 submitCurrentInput()</w:t>
+        <w:rPr>
+          <w:b/>
+        </w:rPr>
+        <w:t>结果处理：</w:t>
+      </w:r>
+      <w:r>
+        <w:t>识别结果填入文本框，若开启自动发送则直接调用 submitCurrentInput()</w:t>
       </w:r>
     </w:p>
     <w:p>
@@ -3180,7 +3311,12 @@
         <w:ind w:left="454"/>
       </w:pPr>
       <w:r>
-        <w:t xml:space="preserve">    │   ├── AnimePlugin.h / .cpp     #   动画插件数据结构 + JSON加载</w:t>
+        <w:rPr>
+          <w:rFonts w:ascii="Consolas" w:hAnsi="Consolas"/>
+          <w:color w:val="333333"/>
+          <w:sz w:val="17"/>
+        </w:rPr>
+        <w:t>│   │   ├── AnimePlugin.h / .cpp     #   动画插件数据结构 + JSON加载</w:t>
       </w:r>
     </w:p>
     <w:p>
@@ -3189,7 +3325,12 @@
         <w:ind w:left="454"/>
       </w:pPr>
       <w:r>
-        <w:t xml:space="preserve">    │   ├── AnimePluginManager.h/.cpp#   动画插件索引管理</w:t>
+        <w:rPr>
+          <w:rFonts w:ascii="Consolas" w:hAnsi="Consolas"/>
+          <w:color w:val="333333"/>
+          <w:sz w:val="17"/>
+        </w:rPr>
+        <w:t>│   │   ├── AnimePluginManager.h/.cpp#   动画插件索引管理</w:t>
       </w:r>
     </w:p>
     <w:p>
@@ -3198,7 +3339,12 @@
         <w:ind w:left="454"/>
       </w:pPr>
       <w:r>
-        <w:t xml:space="preserve">    │   ├── DragHelper.h / .cpp      #   无边框窗口拖拽辅助</w:t>
+        <w:rPr>
+          <w:rFonts w:ascii="Consolas" w:hAnsi="Consolas"/>
+          <w:color w:val="333333"/>
+          <w:sz w:val="17"/>
+        </w:rPr>
+        <w:t>│   │   ├── DragHelper.h / .cpp      #   无边框窗口拖拽辅助</w:t>
       </w:r>
     </w:p>
     <w:p>
@@ -3207,7 +3353,12 @@
         <w:ind w:left="454"/>
       </w:pPr>
       <w:r>
-        <w:t xml:space="preserve">    │   ├── CustomScrollBinder.h/.cpp#   自定义滚动条绑定</w:t>
+        <w:rPr>
+          <w:rFonts w:ascii="Consolas" w:hAnsi="Consolas"/>
+          <w:color w:val="333333"/>
+          <w:sz w:val="17"/>
+        </w:rPr>
+        <w:t>│   │   └── CustomScrollBinder.h/.cpp#   自定义滚动条绑定</w:t>
       </w:r>
     </w:p>
     <w:p>
@@ -3216,7 +3367,12 @@
         <w:ind w:left="454"/>
       </w:pPr>
       <w:r>
-        <w:t xml:space="preserve">    │   └── WakeWordDetector.h/.cpp  #   语音唤醒关键词检测（sherpa-onnx）</w:t>
+        <w:rPr>
+          <w:rFonts w:ascii="Consolas" w:hAnsi="Consolas"/>
+          <w:color w:val="333333"/>
+          <w:sz w:val="17"/>
+        </w:rPr>
+        <w:t>│   │</w:t>
       </w:r>
     </w:p>
     <w:p>
@@ -3239,7 +3395,12 @@
         <w:ind w:left="454"/>
       </w:pPr>
       <w:r>
-        <w:t xml:space="preserve">    │   ├── ElaWidgetTools/          #   Fluent UI 组件库</w:t>
+        <w:rPr>
+          <w:rFonts w:ascii="Consolas" w:hAnsi="Consolas"/>
+          <w:color w:val="333333"/>
+          <w:sz w:val="17"/>
+        </w:rPr>
+        <w:t>│   │   ├── ElaWidgetTools/          #   Fluent UI 组件库</w:t>
       </w:r>
     </w:p>
     <w:p>
@@ -3248,7 +3409,12 @@
         <w:ind w:left="454"/>
       </w:pPr>
       <w:r>
-        <w:t xml:space="preserve">    │   ├── ZcAILib/                 #   AI API请求库</w:t>
+        <w:rPr>
+          <w:rFonts w:ascii="Consolas" w:hAnsi="Consolas"/>
+          <w:color w:val="333333"/>
+          <w:sz w:val="17"/>
+        </w:rPr>
+        <w:t>│   │   ├── ZcAILib/                 #   AI API请求库</w:t>
       </w:r>
     </w:p>
     <w:p>
@@ -3257,7 +3423,12 @@
         <w:ind w:left="454"/>
       </w:pPr>
       <w:r>
-        <w:t xml:space="preserve">    │   ├── ZcJsonLib/              #   JSON读写库</w:t>
+        <w:rPr>
+          <w:rFonts w:ascii="Consolas" w:hAnsi="Consolas"/>
+          <w:color w:val="333333"/>
+          <w:sz w:val="17"/>
+        </w:rPr>
+        <w:t>│   │   ├── ZcJsonLib/              #   JSON读写库</w:t>
       </w:r>
     </w:p>
     <w:p>
@@ -3266,7 +3437,12 @@
         <w:ind w:left="454"/>
       </w:pPr>
       <w:r>
-        <w:t xml:space="preserve">    │   ├── ZcWidgetTools/           #   ElaWidgetTools扩展</w:t>
+        <w:rPr>
+          <w:rFonts w:ascii="Consolas" w:hAnsi="Consolas"/>
+          <w:color w:val="333333"/>
+          <w:sz w:val="17"/>
+        </w:rPr>
+        <w:t>│   │   └── ZcWidgetTools/           #   ElaWidgetTools扩展</w:t>
       </w:r>
     </w:p>
     <w:p>
@@ -3275,7 +3451,12 @@
         <w:ind w:left="454"/>
       </w:pPr>
       <w:r>
-        <w:t xml:space="preserve">    │   └── sherpa-onnx/             #   离线关键词识别引擎SDK</w:t>
+        <w:rPr>
+          <w:rFonts w:ascii="Consolas" w:hAnsi="Consolas"/>
+          <w:color w:val="333333"/>
+          <w:sz w:val="17"/>
+        </w:rPr>
+        <w:t>│   │</w:t>
       </w:r>
     </w:p>
     <w:p>
@@ -3564,12 +3745,24 @@
     </w:p>
     <w:p>
       <w:r>
-        <w:t>7. 记忆系统：对话历史持久化存储（JSON 格式），支持查看历史记录、回溯到任意历史节点并继续对话。支持对话历史自动压缩（超60行自动摘要）和逐条删除，避免上下文过长导致响应变慢。</w:t>
+        <w:rPr>
+          <w:b/>
+        </w:rPr>
+        <w:t>7. 记忆系统：</w:t>
+      </w:r>
+      <w:r>
+        <w:t>对话历史持久化存储（JSON 格式），支持查看历史记录、回溯到任意历史节点并继续对话，为长期记忆与性格成长奠定基础。</w:t>
       </w:r>
     </w:p>
     <w:p>
       <w:r>
-        <w:t>8. 模块化配置：采用双轨制配置存储：敏感信息（API Key）用 JSON 便于迁移，界面状态用 INI（QSettings）便于快速读写。</w:t>
+        <w:rPr>
+          <w:b/>
+        </w:rPr>
+        <w:t>8. 模块化配置：</w:t>
+      </w:r>
+      <w:r>
+        <w:t>采用双轨制配置存储：敏感信息（API Key）用 JSON 便于迁移，界面状态用 INI（QSettings）便于快速读写。</w:t>
       </w:r>
     </w:p>
     <w:p>
@@ -3577,22 +3770,40 @@
         <w:pStyle w:val="Heading1"/>
       </w:pPr>
       <w:r>
-        <w:t>9. 多模态交互：支持屏幕截图分析（Kimi 视觉 API），可通过自然语言关键词（"看看屏幕""看看这是什么"等）触发屏幕捕获。独立的视觉 API 配置，不影响对话模型选择。</w:t>
+        <w:t>七、相关链接</w:t>
       </w:r>
     </w:p>
     <w:p>
       <w:r>
-        <w:t>10. 语音唤醒：基于 sherpa-onnx 离线关键词识别引擎，完全离线运行无需联网。说出唤醒词"萝卜子"即可自动开始录音，零延迟响应。</w:t>
+        <w:rPr>
+          <w:b/>
+        </w:rPr>
+        <w:t>ZcChat2 主程序：</w:t>
+      </w:r>
+      <w:r>
+        <w:t>https://github.com/Zao-chen/ZcChat2</w:t>
       </w:r>
     </w:p>
     <w:p>
       <w:r>
-        <w:t>11. 连续对话模式：独立快捷键一键进入全自动对话循环（录音→识别→发送→AI回复→语音播完→自动下一轮），全程无需手动操作。静音检测自动结束录音，2分钟无活动自动退出。</w:t>
+        <w:rPr>
+          <w:b/>
+        </w:rPr>
+        <w:t>ZcChat2 移动端：</w:t>
+      </w:r>
+      <w:r>
+        <w:t>https://github.com/Zao-chen/ZcChat2ForMobile</w:t>
       </w:r>
     </w:p>
     <w:p>
       <w:r>
-        <w:t>12. 性能优化：系统提示词缓存减少重复构建、流式显示50ms防抖、记忆提取延迟执行、录音QAudioSource直录PCM消除音源冲突。</w:t>
+        <w:rPr>
+          <w:b/>
+        </w:rPr>
+        <w:t>ZcChat 前代项目：</w:t>
+      </w:r>
+      <w:r>
+        <w:t>https://github.com/Zao-chen/ZcChat</w:t>
       </w:r>
     </w:p>
     <w:p>

</xml_diff>